<commit_message>
feat(docs): update templates, fix kyu download link, unify kata/dan page content
</commit_message>
<xml_diff>
--- a/src/templates/Volantino_stagione_TEMPLATE.docx
+++ b/src/templates/Volantino_stagione_TEMPLATE.docx
@@ -8,34 +8,28 @@
         <w:bidi w:val="0"/>
         <w:jc w:val="left"/>
         <w:rPr>
-          <w:b/>
-          <w:bCs/>
-          <w:i/>
-          <w:i/>
-          <w:iCs/>
+          <w:rFonts w:ascii="Liberation Serif" w:hAnsi="Liberation Serif" w:eastAsia="NSimSun" w:cs="Lucida Sans"/>
+          <w:b/>
+          <w:bCs/>
+          <w:color w:val="auto"/>
+          <w:kern w:val="2"/>
           <w:sz w:val="40"/>
           <w:szCs w:val="40"/>
-          <w:shd w:fill="00A933" w:val="clear"/>
-        </w:rPr>
-      </w:pPr>
-      <w:r>
-        <w:rPr>
-          <w:b/>
-          <w:bCs/>
-          <w:i/>
-          <w:iCs/>
-          <w:sz w:val="40"/>
-          <w:szCs w:val="40"/>
-          <w:shd w:fill="00A933" w:val="clear"/>
-        </w:rPr>
+          <w:highlight w:val="none"/>
+          <w:shd w:fill="auto" w:val="clear"/>
+          <w:lang w:val="it-IT" w:eastAsia="zh-CN" w:bidi="hi-IN"/>
+        </w:rPr>
+      </w:pPr>
+      <w:r>
+        <w:rPr/>
         <w:drawing>
           <wp:anchor behindDoc="0" distT="0" distB="0" distL="0" distR="0" simplePos="0" locked="0" layoutInCell="0" allowOverlap="1" relativeHeight="2">
             <wp:simplePos x="0" y="0"/>
             <wp:positionH relativeFrom="column">
-              <wp:posOffset>2217420</wp:posOffset>
+              <wp:posOffset>1859280</wp:posOffset>
             </wp:positionH>
             <wp:positionV relativeFrom="paragraph">
-              <wp:posOffset>17145</wp:posOffset>
+              <wp:posOffset>-42545</wp:posOffset>
             </wp:positionV>
             <wp:extent cx="2534920" cy="508000"/>
             <wp:effectExtent l="0" t="0" r="0" b="0"/>
@@ -75,18 +69,26 @@
           </wp:anchor>
         </w:drawing>
         <w:drawing>
-          <wp:anchor behindDoc="0" distT="0" distB="0" distL="0" distR="0" simplePos="0" locked="0" layoutInCell="0" allowOverlap="1" relativeHeight="4">
+          <wp:anchor behindDoc="0" distT="0" distB="0" distL="114935" distR="114935" simplePos="0" locked="0" layoutInCell="0" allowOverlap="1" relativeHeight="4">
             <wp:simplePos x="0" y="0"/>
             <wp:positionH relativeFrom="column">
-              <wp:posOffset>-19685</wp:posOffset>
+              <wp:posOffset>105410</wp:posOffset>
             </wp:positionH>
             <wp:positionV relativeFrom="paragraph">
-              <wp:posOffset>-13970</wp:posOffset>
+              <wp:posOffset>-400685</wp:posOffset>
             </wp:positionV>
-            <wp:extent cx="1551940" cy="1042670"/>
+            <wp:extent cx="1285240" cy="1274445"/>
             <wp:effectExtent l="0" t="0" r="0" b="0"/>
-            <wp:wrapSquare wrapText="largest"/>
-            <wp:docPr id="2" name="Immagine2" descr=""/>
+            <wp:wrapTight wrapText="bothSides">
+              <wp:wrapPolygon edited="0">
+                <wp:start x="-126" y="0"/>
+                <wp:lineTo x="-126" y="21406"/>
+                <wp:lineTo x="21560" y="21406"/>
+                <wp:lineTo x="21560" y="0"/>
+                <wp:lineTo x="-126" y="0"/>
+              </wp:wrapPolygon>
+            </wp:wrapTight>
+            <wp:docPr id="2" name="Copia Immagine1 1" descr=""/>
             <wp:cNvGraphicFramePr>
               <a:graphicFrameLocks xmlns:a="http://schemas.openxmlformats.org/drawingml/2006/main" noChangeAspect="1"/>
             </wp:cNvGraphicFramePr>
@@ -94,14 +96,14 @@
               <a:graphicData uri="http://schemas.openxmlformats.org/drawingml/2006/picture">
                 <pic:pic xmlns:pic="http://schemas.openxmlformats.org/drawingml/2006/picture">
                   <pic:nvPicPr>
-                    <pic:cNvPr id="2" name="Immagine2" descr=""/>
+                    <pic:cNvPr id="2" name="Copia Immagine1 1" descr=""/>
                     <pic:cNvPicPr>
                       <a:picLocks noChangeAspect="1" noChangeArrowheads="1"/>
                     </pic:cNvPicPr>
                   </pic:nvPicPr>
                   <pic:blipFill>
                     <a:blip r:embed="rId3"/>
-                    <a:srcRect l="0" t="0" r="3506" b="3577"/>
+                    <a:srcRect l="-40" t="-41" r="-40" b="-41"/>
                     <a:stretch>
                       <a:fillRect/>
                     </a:stretch>
@@ -109,7 +111,7 @@
                   <pic:spPr bwMode="auto">
                     <a:xfrm>
                       <a:off x="0" y="0"/>
-                      <a:ext cx="1551940" cy="1042670"/>
+                      <a:ext cx="1285240" cy="1274445"/>
                     </a:xfrm>
                     <a:prstGeom prst="rect">
                       <a:avLst/>
@@ -131,91 +133,81 @@
       </w:pPr>
       <w:r>
         <w:rPr>
+          <w:rFonts w:eastAsia="NSimSun" w:cs="Lucida Sans"/>
+          <w:b/>
+          <w:bCs/>
+          <w:color w:val="000000"/>
+          <w:kern w:val="2"/>
+          <w:sz w:val="40"/>
+          <w:szCs w:val="40"/>
+          <w:shd w:fill="auto" w:val="clear"/>
+          <w:lang w:val="it-IT" w:eastAsia="zh-CN" w:bidi="hi-IN"/>
+        </w:rPr>
+        <w:t xml:space="preserve"> </w:t>
+      </w:r>
+      <w:r>
+        <w:rPr>
+          <w:rFonts w:eastAsia="NSimSun" w:cs="Lucida Sans"/>
+          <w:b/>
+          <w:bCs/>
+          <w:color w:val="FFFFFF"/>
+          <w:kern w:val="2"/>
           <w:sz w:val="40"/>
           <w:szCs w:val="40"/>
           <w:shd w:fill="00A933" w:val="clear"/>
-        </w:rPr>
+          <w:lang w:val="it-IT" w:eastAsia="zh-CN" w:bidi="hi-IN"/>
+        </w:rPr>
+        <w:t xml:space="preserve">  </w:t>
+      </w:r>
+      <w:r>
+        <w:rPr>
+          <w:shd w:fill="00A933" w:val="clear"/>
+        </w:rPr>
+        <w:t xml:space="preserve">                                               </w:t>
+      </w:r>
+      <w:r>
+        <w:rPr/>
         <w:t xml:space="preserve"> </w:t>
       </w:r>
-      <w:r>
-        <w:rPr>
-          <w:b/>
-          <w:bCs/>
+    </w:p>
+    <w:p>
+      <w:pPr>
+        <w:pStyle w:val="Normal"/>
+        <w:bidi w:val="0"/>
+        <w:jc w:val="center"/>
+        <w:rPr>
+          <w:i/>
+          <w:i/>
+          <w:iCs/>
+          <w:sz w:val="32"/>
+          <w:szCs w:val="32"/>
+        </w:rPr>
+      </w:pPr>
+      <w:r>
+        <w:rPr/>
+      </w:r>
+    </w:p>
+    <w:p>
+      <w:pPr>
+        <w:pStyle w:val="Normal"/>
+        <w:bidi w:val="0"/>
+        <w:jc w:val="center"/>
+        <w:rPr>
+          <w:i/>
+          <w:i/>
+          <w:iCs/>
+          <w:sz w:val="32"/>
+          <w:szCs w:val="32"/>
+        </w:rPr>
+      </w:pPr>
+      <w:r>
+        <w:rPr>
+          <w:b/>
+          <w:bCs/>
+          <w:i/>
+          <w:iCs/>
           <w:sz w:val="40"/>
           <w:szCs w:val="40"/>
-          <w:shd w:fill="00A933" w:val="clear"/>
-        </w:rPr>
-        <w:t xml:space="preserve">   </w:t>
-      </w:r>
-      <w:r>
-        <w:rPr>
-          <w:shd w:fill="00A933" w:val="clear"/>
-        </w:rPr>
-        <w:t xml:space="preserve">                                                </w:t>
-      </w:r>
-      <w:r>
-        <w:rPr/>
-        <w:t xml:space="preserve"> </w:t>
-      </w:r>
-    </w:p>
-    <w:p>
-      <w:pPr>
-        <w:pStyle w:val="Normal"/>
-        <w:bidi w:val="0"/>
-        <w:jc w:val="left"/>
-        <w:rPr>
-          <w:b/>
-          <w:bCs/>
-          <w:i/>
-          <w:i/>
-          <w:iCs/>
-          <w:sz w:val="40"/>
-          <w:szCs w:val="40"/>
-        </w:rPr>
-      </w:pPr>
-      <w:r>
-        <w:rPr>
-          <w:b/>
-          <w:bCs/>
-          <w:i/>
-          <w:iCs/>
-          <w:sz w:val="40"/>
-          <w:szCs w:val="40"/>
-        </w:rPr>
-      </w:r>
-    </w:p>
-    <w:p>
-      <w:pPr>
-        <w:pStyle w:val="Normal"/>
-        <w:bidi w:val="0"/>
-        <w:jc w:val="left"/>
-        <w:rPr>
-          <w:i/>
-          <w:i/>
-          <w:iCs/>
-          <w:sz w:val="32"/>
-          <w:szCs w:val="32"/>
-        </w:rPr>
-      </w:pPr>
-      <w:r>
-        <w:rPr>
-          <w:b/>
-          <w:bCs/>
-          <w:i/>
-          <w:iCs/>
-          <w:sz w:val="40"/>
-          <w:szCs w:val="40"/>
-        </w:rPr>
-        <w:t xml:space="preserve">      </w:t>
-      </w:r>
-      <w:r>
-        <w:rPr>
-          <w:b/>
-          <w:bCs/>
-          <w:i/>
-          <w:iCs/>
-          <w:sz w:val="40"/>
-          <w:szCs w:val="40"/>
         </w:rPr>
         <w:t xml:space="preserve">L’ A. S. D. JUDO KIHON </w:t>
       </w:r>
@@ -226,6 +218,9 @@
         <w:bidi w:val="0"/>
         <w:jc w:val="center"/>
         <w:rPr>
+          <w:i/>
+          <w:i/>
+          <w:iCs/>
           <w:sz w:val="32"/>
           <w:szCs w:val="32"/>
         </w:rPr>
@@ -238,25 +233,7 @@
           <w:szCs w:val="32"/>
         </w:rPr>
         <w:t>Organizza per la stagione sportiva {{stagione}}</w:t>
-      </w:r>
-    </w:p>
-    <w:p>
-      <w:pPr>
-        <w:pStyle w:val="Normal"/>
-        <w:bidi w:val="0"/>
-        <w:jc w:val="center"/>
-        <w:rPr>
-          <w:sz w:val="32"/>
-          <w:szCs w:val="32"/>
-        </w:rPr>
-      </w:pPr>
-      <w:r>
-        <w:rPr>
-          <w:i/>
-          <w:iCs/>
-          <w:sz w:val="32"/>
-          <w:szCs w:val="32"/>
-        </w:rPr>
+        <w:br/>
         <w:t>corsi di Judo per Bambini Ragazzi e Adulti.</w:t>
       </w:r>
     </w:p>

</xml_diff>